<commit_message>
Adiciona modo de demonstracao com dados de exemplo (--demo)
- Novo modulo seed (seed.h/seed.c) que povoa o sistema reutilizando as
  funcoes dos modulos: 3 viaturas, 2 motoristas e 3 corridas
- main aceita --demo e usa ficheiro de dados separado (data/taxi-demo.dat)
- Makefile: novo alvo "make demo"
- Documentacao e guiao atualizados com o atalho e a seccao "Como testar"

Co-Authored-By: Claude Opus 4.8 <noreply@anthropic.com>
</commit_message>
<xml_diff>
--- a/docs/DOCUMENTACAO.docx
+++ b/docs/DOCUMENTACAO.docx
@@ -115,7 +115,7 @@
         </w:rPr>
         <w:t xml:space="preserve">Repositorio: </w:t>
       </w:r>
-      <w:hyperlink w:history="1" r:id="rIdxwtk-vq8588b0gstq3yqi">
+      <w:hyperlink w:history="1" r:id="rId1uxyyvf47w6l3mih3xo5m">
         <w:r>
           <w:rPr>
             <w:rStyle w:val="Hyperlink"/>
@@ -1219,6 +1219,60 @@
           </w:p>
         </w:tc>
       </w:tr>
+      <w:tr>
+        <w:tc>
+          <w:tcPr>
+            <w:tcW w:type="dxa" w:w="2200"/>
+            <w:tcBorders>
+              <w:top w:val="single" w:color="CCCCCC" w:sz="1"/>
+              <w:left w:val="single" w:color="CCCCCC" w:sz="1"/>
+              <w:bottom w:val="single" w:color="CCCCCC" w:sz="1"/>
+              <w:right w:val="single" w:color="CCCCCC" w:sz="1"/>
+            </w:tcBorders>
+            <w:tcMar>
+              <w:top w:type="dxa" w:w="70"/>
+              <w:left w:type="dxa" w:w="120"/>
+              <w:bottom w:type="dxa" w:w="70"/>
+              <w:right w:type="dxa" w:w="120"/>
+            </w:tcMar>
+            <w:vAlign w:val="center"/>
+          </w:tcPr>
+          <w:p>
+            <w:r>
+              <w:rPr>
+                <w:rFonts w:ascii="Consolas" w:cs="Consolas" w:eastAsia="Consolas" w:hAnsi="Consolas"/>
+                <w:b/>
+                <w:bCs/>
+                <w:color w:val="1F4E79"/>
+              </w:rPr>
+              <w:t xml:space="preserve">seed.h</w:t>
+            </w:r>
+          </w:p>
+        </w:tc>
+        <w:tc>
+          <w:tcPr>
+            <w:tcW w:type="dxa" w:w="6826"/>
+            <w:tcBorders>
+              <w:top w:val="single" w:color="CCCCCC" w:sz="1"/>
+              <w:left w:val="single" w:color="CCCCCC" w:sz="1"/>
+              <w:bottom w:val="single" w:color="CCCCCC" w:sz="1"/>
+              <w:right w:val="single" w:color="CCCCCC" w:sz="1"/>
+            </w:tcBorders>
+            <w:tcMar>
+              <w:top w:type="dxa" w:w="70"/>
+              <w:left w:type="dxa" w:w="120"/>
+              <w:bottom w:type="dxa" w:w="70"/>
+              <w:right w:type="dxa" w:w="120"/>
+            </w:tcMar>
+            <w:vAlign w:val="center"/>
+          </w:tcPr>
+          <w:p>
+            <w:r>
+              <w:t xml:space="preserve">Interface da funcao que povoa o sistema com dados de exemplo.</w:t>
+            </w:r>
+          </w:p>
+        </w:tc>
+      </w:tr>
     </w:tbl>
     <w:p>
       <w:pPr>
@@ -1852,6 +1906,60 @@
           </w:p>
         </w:tc>
       </w:tr>
+      <w:tr>
+        <w:tc>
+          <w:tcPr>
+            <w:tcW w:type="dxa" w:w="2200"/>
+            <w:tcBorders>
+              <w:top w:val="single" w:color="CCCCCC" w:sz="1"/>
+              <w:left w:val="single" w:color="CCCCCC" w:sz="1"/>
+              <w:bottom w:val="single" w:color="CCCCCC" w:sz="1"/>
+              <w:right w:val="single" w:color="CCCCCC" w:sz="1"/>
+            </w:tcBorders>
+            <w:tcMar>
+              <w:top w:type="dxa" w:w="70"/>
+              <w:left w:type="dxa" w:w="120"/>
+              <w:bottom w:type="dxa" w:w="70"/>
+              <w:right w:type="dxa" w:w="120"/>
+            </w:tcMar>
+            <w:vAlign w:val="center"/>
+          </w:tcPr>
+          <w:p>
+            <w:r>
+              <w:rPr>
+                <w:rFonts w:ascii="Consolas" w:cs="Consolas" w:eastAsia="Consolas" w:hAnsi="Consolas"/>
+                <w:b/>
+                <w:bCs/>
+                <w:color w:val="1F4E79"/>
+              </w:rPr>
+              <w:t xml:space="preserve">seed.c</w:t>
+            </w:r>
+          </w:p>
+        </w:tc>
+        <w:tc>
+          <w:tcPr>
+            <w:tcW w:type="dxa" w:w="6826"/>
+            <w:tcBorders>
+              <w:top w:val="single" w:color="CCCCCC" w:sz="1"/>
+              <w:left w:val="single" w:color="CCCCCC" w:sz="1"/>
+              <w:bottom w:val="single" w:color="CCCCCC" w:sz="1"/>
+              <w:right w:val="single" w:color="CCCCCC" w:sz="1"/>
+            </w:tcBorders>
+            <w:tcMar>
+              <w:top w:type="dxa" w:w="70"/>
+              <w:left w:type="dxa" w:w="120"/>
+              <w:bottom w:type="dxa" w:w="70"/>
+              <w:right w:type="dxa" w:w="120"/>
+            </w:tcMar>
+            <w:vAlign w:val="center"/>
+          </w:tcPr>
+          <w:p>
+            <w:r>
+              <w:t xml:space="preserve">Povoa o sistema com dados de exemplo (3 viaturas, 2 motoristas e 3 corridas) reutilizando as funcoes dos modulos. Usado no modo de demonstracao.</w:t>
+            </w:r>
+          </w:p>
+        </w:tc>
+      </w:tr>
     </w:tbl>
     <w:p>
       <w:pPr>
@@ -2510,6 +2618,56 @@
           <w:rFonts w:ascii="Consolas" w:cs="Consolas" w:eastAsia="Consolas" w:hAnsi="Consolas"/>
         </w:rPr>
         <w:t xml:space="preserve">gcc -std=c11 -Wall -Wextra -Iinclude src/*.c -o taxi-control-system</w:t>
+      </w:r>
+    </w:p>
+    <w:p>
+      <w:pPr>
+        <w:pStyle w:val="Heading1"/>
+      </w:pPr>
+      <w:r>
+        <w:t xml:space="preserve">11. Demonstracao com dados de exemplo</w:t>
+      </w:r>
+    </w:p>
+    <w:p>
+      <w:pPr>
+        <w:spacing w:after="140" w:line="276"/>
+        <w:jc w:val="both"/>
+      </w:pPr>
+      <w:r>
+        <w:t xml:space="preserve">Para uma demonstracao imediata, o programa aceita o argumento --demo, que arranca ja com dados de exemplo carregados (3 viaturas, sendo 1 em manutencao; 2 motoristas; e 3 corridas). Os dados de demonstracao sao gravados num ficheiro separado (data/taxi-demo.dat) e nao afetam os dados reais.</w:t>
+      </w:r>
+    </w:p>
+    <w:p>
+      <w:pPr>
+        <w:shd w:fill="F2F2F2" w:val="clear"/>
+        <w:spacing w:after="100"/>
+      </w:pPr>
+      <w:r>
+        <w:rPr>
+          <w:rFonts w:ascii="Consolas" w:cs="Consolas" w:eastAsia="Consolas" w:hAnsi="Consolas"/>
+        </w:rPr>
+        <w:t xml:space="preserve">make demo</w:t>
+      </w:r>
+    </w:p>
+    <w:p>
+      <w:pPr>
+        <w:shd w:fill="F2F2F2" w:val="clear"/>
+        <w:spacing w:after="140"/>
+      </w:pPr>
+      <w:r>
+        <w:rPr>
+          <w:rFonts w:ascii="Consolas" w:cs="Consolas" w:eastAsia="Consolas" w:hAnsi="Consolas"/>
+        </w:rPr>
+        <w:t xml:space="preserve">gcc -std=c11 -Wall -Wextra -Iinclude src/*.c -o taxi-control-system &amp;&amp; ./taxi-control-system --demo</w:t>
+      </w:r>
+    </w:p>
+    <w:p>
+      <w:pPr>
+        <w:spacing w:after="140" w:line="276"/>
+        <w:jc w:val="both"/>
+      </w:pPr>
+      <w:r>
+        <w:t xml:space="preserve">Neste modo, o relatorio Resumo Geral apresenta 3 viaturas (2 disponiveis, 1 em manutencao), 2 motoristas, 3 corridas e uma receita total de 27,39, o que permite mostrar de imediato os relatorios e as validacoes do sistema.</w:t>
       </w:r>
     </w:p>
     <w:sectPr>

</xml_diff>